<commit_message>
feat: add TeacherAID to the CV docx and markdown source
Co-Authored-By: Claude Opus 5 (1M context) <noreply@anthropic.com>
</commit_message>
<xml_diff>
--- a/Academic CV - UW Madison.docx
+++ b/Academic CV - UW Madison.docx
@@ -768,6 +768,65 @@
       </w:r>
       <w:r>
         <w:t>.</w:t>
+      </w:r>
+    </w:p>
+    <w:p>
+      <w:pPr>
+        <w:spacing w:before="160" w:after="40"/>
+      </w:pPr>
+      <w:r>
+        <w:rPr>
+          <w:b/>
+          <w:sz w:val="23"/>
+        </w:rPr>
+        <w:t xml:space="preserve">TeacherAID (2026-present)</w:t>
+      </w:r>
+    </w:p>
+    <w:p>
+      <w:pPr>
+        <w:spacing w:after="80"/>
+      </w:pPr>
+      <w:r>
+        <w:rPr>
+          <w:i/>
+        </w:rPr>
+        <w:t xml:space="preserve">A teaching studio manager for an independent music teacher: scheduling, payroll, student records, booking, and business planning, all run from one lesson ledger.</w:t>
+      </w:r>
+    </w:p>
+    <w:p>
+      <w:pPr>
+        <w:pStyle w:val="ListBullet"/>
+        <w:spacing w:after="40"/>
+      </w:pPr>
+      <w:r>
+        <w:t xml:space="preserve">Logs each lesson in one tap (held, cancelled, or excused), and every hour total, pay sheet, and student record updates from that entry.</w:t>
+      </w:r>
+    </w:p>
+    <w:p>
+      <w:pPr>
+        <w:pStyle w:val="ListBullet"/>
+        <w:spacing w:after="40"/>
+      </w:pPr>
+      <w:r>
+        <w:t xml:space="preserve">Builds a pay-period hours sheet for each employer, and locks a submitted period so hours already sent never change.</w:t>
+      </w:r>
+    </w:p>
+    <w:p>
+      <w:pPr>
+        <w:pStyle w:val="ListBullet"/>
+        <w:spacing w:after="40"/>
+      </w:pPr>
+      <w:r>
+        <w:t xml:space="preserve">Lets families book open lesson times from a single link, and turns an income target into weekly teaching hours and a roster size.</w:t>
+      </w:r>
+    </w:p>
+    <w:p>
+      <w:pPr>
+        <w:pStyle w:val="ListBullet"/>
+        <w:spacing w:after="40"/>
+      </w:pPr>
+      <w:r>
+        <w:t xml:space="preserve">Sends scheduled daily, weekly, and pay-period email summaries, with AI observations on each closed period via the Anthropic API.</w:t>
       </w:r>
     </w:p>
     <w:p>

</xml_diff>

<commit_message>
fix: correct typos and missing periods in the CV docx
Co-Authored-By: Claude Opus 5 (1M context) <noreply@anthropic.com>
</commit_message>
<xml_diff>
--- a/Academic CV - UW Madison.docx
+++ b/Academic CV - UW Madison.docx
@@ -322,15 +322,7 @@
         <w:spacing w:after="40"/>
       </w:pPr>
       <w:r>
-        <w:t>Grounds every evaluation in the composer's own reference material, not generic AI assumptions, via a searchable personal music theory library (</w:t>
-      </w:r>
-      <w:proofErr w:type="spellStart"/>
-      <w:r>
-        <w:t>ChromaDB</w:t>
-      </w:r>
-      <w:proofErr w:type="spellEnd"/>
-      <w:r>
-        <w:t>).</w:t>
+        <w:t>Grounds every evaluation in the composer's own reference material, not generic AI assumptions, via a searchable personal music theory library (ChromaDB).</w:t>
       </w:r>
     </w:p>
     <w:p>
@@ -427,17 +419,15 @@
           <w:i/>
           <w:iCs/>
         </w:rPr>
-        <w:t xml:space="preserve"> career side to being a </w:t>
-      </w:r>
-      <w:proofErr w:type="gramStart"/>
+        <w:t xml:space="preserve"> career side of being a composer.</w:t>
+      </w:r>
       <w:r>
         <w:rPr>
           <w:i/>
           <w:iCs/>
         </w:rPr>
-        <w:t>compose</w:t>
-      </w:r>
-      <w:proofErr w:type="gramEnd"/>
+        <w:t xml:space="preserve"/>
+      </w:r>
     </w:p>
     <w:p>
       <w:pPr>
@@ -481,7 +471,7 @@
         <w:t xml:space="preserve">A </w:t>
       </w:r>
       <w:r>
-        <w:t>newsletter builder tool</w:t>
+        <w:t xml:space="preserve">newsletter builder tool.</w:t>
       </w:r>
     </w:p>
     <w:p>
@@ -496,7 +486,7 @@
         <w:t>research and compile</w:t>
       </w:r>
       <w:r>
-        <w:t xml:space="preserve"> new prospects</w:t>
+        <w:t xml:space="preserve"> new prospects.</w:t>
       </w:r>
     </w:p>
     <w:p>
@@ -557,7 +547,7 @@
         <w:t>) plus a set of tools</w:t>
       </w:r>
       <w:r>
-        <w:t>/skills</w:t>
+        <w:t xml:space="preserve">/skills.</w:t>
       </w:r>
       <w:r>
         <w:t xml:space="preserve"> </w:t>
@@ -737,7 +727,7 @@
         <w:t>Social Media Manager: a repository and workspace for social media conten</w:t>
       </w:r>
       <w:r>
-        <w:t>t, with automated publishing feature that runs on a content calendar</w:t>
+        <w:t xml:space="preserve">t, with an automated publishing feature that runs on a content calendar</w:t>
       </w:r>
       <w:r>
         <w:t>.</w:t>
@@ -752,13 +742,13 @@
         <w:t>Campaign</w:t>
       </w:r>
       <w:r>
-        <w:t xml:space="preserve"> Tracker: </w:t>
-      </w:r>
-      <w:r>
-        <w:t xml:space="preserve">A </w:t>
-      </w:r>
-      <w:r>
-        <w:t>dynamic</w:t>
+        <w:t xml:space="preserve"> Tracker: a dynamic</w:t>
+      </w:r>
+      <w:r>
+        <w:t xml:space="preserve"/>
+      </w:r>
+      <w:r>
+        <w:t xml:space="preserve"/>
       </w:r>
       <w:r>
         <w:t xml:space="preserve"> QR code builder that tracks scans </w:t>
@@ -779,7 +769,7 @@
           <w:b/>
           <w:sz w:val="23"/>
         </w:rPr>
-        <w:t xml:space="preserve">TeacherAID (2026-present)</w:t>
+        <w:t>TeacherAID (2026-present)</w:t>
       </w:r>
     </w:p>
     <w:p>
@@ -790,7 +780,7 @@
         <w:rPr>
           <w:i/>
         </w:rPr>
-        <w:t xml:space="preserve">A teaching studio manager for an independent music teacher: scheduling, payroll, student records, booking, and business planning, all run from one lesson ledger.</w:t>
+        <w:t>A teaching studio manager for an independent music teacher: scheduling, payroll, student records, booking, and business planning, all run from one lesson ledger.</w:t>
       </w:r>
     </w:p>
     <w:p>
@@ -799,7 +789,7 @@
         <w:spacing w:after="40"/>
       </w:pPr>
       <w:r>
-        <w:t xml:space="preserve">Logs each lesson in one tap (held, cancelled, or excused), and every hour total, pay sheet, and student record updates from that entry.</w:t>
+        <w:t>Logs each lesson in one tap (held, cancelled, or excused), and every hour total, pay sheet, and student record updates from that entry.</w:t>
       </w:r>
     </w:p>
     <w:p>
@@ -808,7 +798,7 @@
         <w:spacing w:after="40"/>
       </w:pPr>
       <w:r>
-        <w:t xml:space="preserve">Builds a pay-period hours sheet for each employer, and locks a submitted period so hours already sent never change.</w:t>
+        <w:t>Builds a pay-period hours sheet for each employer, and locks a submitted period so hours already sent never change.</w:t>
       </w:r>
     </w:p>
     <w:p>
@@ -817,7 +807,7 @@
         <w:spacing w:after="40"/>
       </w:pPr>
       <w:r>
-        <w:t xml:space="preserve">Lets families book open lesson times from a single link, and turns an income target into weekly teaching hours and a roster size.</w:t>
+        <w:t>Lets families book open lesson times from a single link, and turns an income target into weekly teaching hours and a roster size.</w:t>
       </w:r>
     </w:p>
     <w:p>
@@ -826,7 +816,7 @@
         <w:spacing w:after="40"/>
       </w:pPr>
       <w:r>
-        <w:t xml:space="preserve">Sends scheduled daily, weekly, and pay-period email summaries, with AI observations on each closed period via the Anthropic API.</w:t>
+        <w:t>Sends scheduled daily, weekly, and pay-period email summaries, with AI observations on each closed period via the Anthropic API.</w:t>
       </w:r>
     </w:p>
     <w:p>
@@ -957,6 +947,7 @@
         <w:spacing w:after="40"/>
       </w:pPr>
       <w:r>
+        <w:lastRenderedPageBreak/>
         <w:t xml:space="preserve">Owned strategy, product, marketing, and finances. </w:t>
       </w:r>
       <w:r>
@@ -1074,7 +1065,7 @@
           <w:rPr>
             <w:rStyle w:val="Hyperlink"/>
           </w:rPr>
-          <w:t>concert music styles</w:t>
+          <w:t xml:space="preserve">concert music styles.</w:t>
         </w:r>
       </w:hyperlink>
     </w:p>
@@ -1087,7 +1078,7 @@
         <w:t>Songwriting and producer credits</w:t>
       </w:r>
       <w:r>
-        <w:t xml:space="preserve"> for pop and rock (John Harvie, Brett Altman)</w:t>
+        <w:t xml:space="preserve"> for pop and rock (John Harvie, Brett Altman).</w:t>
       </w:r>
     </w:p>
     <w:p>
@@ -1102,7 +1093,7 @@
         <w:t xml:space="preserve">sic and re-debut concert </w:t>
       </w:r>
       <w:r>
-        <w:t>in June 2026 in NYC</w:t>
+        <w:t xml:space="preserve">in June 2026 in NYC.</w:t>
       </w:r>
     </w:p>
     <w:p>
@@ -1111,11 +1102,10 @@
         <w:spacing w:after="40"/>
       </w:pPr>
       <w:r>
-        <w:lastRenderedPageBreak/>
         <w:t>Produce and host a concert music series</w:t>
       </w:r>
       <w:r>
-        <w:t xml:space="preserve"> for composers and performers in NYC </w:t>
+        <w:t xml:space="preserve"> for composers and performers in NYC. </w:t>
       </w:r>
     </w:p>
     <w:sectPr>

</xml_diff>